<commit_message>
Hilo entre PMO360 y FARO: anillo de 360° con cuatro cuartos de vuelta
Actualiza lámina (PPTX, PDF y PNG), guion para exponer, documento corto, guion de video
y ESPECIFICACION.md.

Co-Authored-By: Claude Sonnet 5.5 <noreply@anthropic.com>
Claude-Session: https://claude.ai/code/session_01WMKrhm5xPWgYnrpAyVAk9z
</commit_message>
<xml_diff>
--- a/docs/presentacion-faro/01-guion-para-exponer.docx
+++ b/docs/presentacion-faro/01-guion-para-exponer.docx
@@ -186,6 +186,104 @@
         </w:rPr>
         <w:t>. Dilo en voz alta («les cuento una escena que probablemente reconocen»).</w:t>
       </w:r>
+    </w:p>
+    <w:tbl>
+      <w:tblPr>
+        <w:tblW w:type="auto" w:w="0"/>
+        <w:jc w:val="center"/>
+        <w:tblLook w:firstColumn="1" w:firstRow="1" w:lastColumn="0" w:lastRow="0" w:noHBand="0" w:noVBand="1" w:val="04A0"/>
+      </w:tblPr>
+      <w:tblGrid>
+        <w:gridCol w:w="9638"/>
+      </w:tblGrid>
+      <w:tr>
+        <w:tc>
+          <w:tcPr>
+            <w:tcW w:type="dxa" w:w="9638"/>
+            <w:shd w:val="clear" w:color="auto" w:fill="E6F1D1"/>
+            <w:tcBorders>
+              <w:top w:val="nil"/>
+              <w:left w:val="single" w:sz="24" w:color="4C700B"/>
+              <w:bottom w:val="nil"/>
+              <w:right w:val="nil"/>
+            </w:tcBorders>
+          </w:tcPr>
+          <w:p>
+            <w:pPr>
+              <w:spacing w:after="40"/>
+            </w:pPr>
+            <w:r>
+              <w:rPr>
+                <w:b/>
+                <w:color w:val="7C401D"/>
+                <w:sz w:val="17"/>
+              </w:rPr>
+              <w:t xml:space="preserve">HILO  </w:t>
+            </w:r>
+            <w:r>
+              <w:rPr>
+                <w:b/>
+                <w:i w:val="0"/>
+              </w:rPr>
+              <w:t>El hilo entre PMO360 y FARO.</w:t>
+            </w:r>
+            <w:r>
+              <w:rPr>
+                <w:b w:val="0"/>
+                <w:i w:val="0"/>
+              </w:rPr>
+              <w:t xml:space="preserve"> PMO360 es el nombre de la plataforma: el </w:t>
+            </w:r>
+            <w:r>
+              <w:rPr>
+                <w:b/>
+                <w:i w:val="0"/>
+              </w:rPr>
+              <w:t>360</w:t>
+            </w:r>
+            <w:r>
+              <w:rPr>
+                <w:b w:val="0"/>
+                <w:i w:val="0"/>
+              </w:rPr>
+              <w:t xml:space="preserve"> es la vuelta completa, la visión integral (el lema es «Control integral de Proyectos»). FARO es la forma de explicarla y de adoptarla: </w:t>
+            </w:r>
+            <w:r>
+              <w:rPr>
+                <w:b/>
+                <w:i w:val="0"/>
+              </w:rPr>
+              <w:t>cuatro pasos, y cada uno ilumina un cuarto de vuelta</w:t>
+            </w:r>
+            <w:r>
+              <w:rPr>
+                <w:b w:val="0"/>
+                <w:i w:val="0"/>
+              </w:rPr>
+              <w:t xml:space="preserve"> (4 × 90° = 360°). Frase puente: </w:t>
+            </w:r>
+            <w:r>
+              <w:rPr>
+                <w:b/>
+                <w:i w:val="0"/>
+              </w:rPr>
+              <w:t>«PMO360 es la luz que gira; FARO son los cuatro cuartos de vuelta que la mantienen encendida».</w:t>
+            </w:r>
+            <w:r>
+              <w:rPr>
+                <w:b w:val="0"/>
+                <w:i w:val="0"/>
+              </w:rPr>
+              <w:t xml:space="preserve"> Aparece en la apertura, al final de cada paso y en el cierre.</w:t>
+            </w:r>
+          </w:p>
+        </w:tc>
+      </w:tr>
+    </w:tbl>
+    <w:p>
+      <w:pPr>
+        <w:spacing w:after="40"/>
+      </w:pPr>
     </w:p>
     <w:tbl>
       <w:tblPr>
@@ -973,7 +1071,58 @@
           <w:b w:val="0"/>
           <w:i w:val="0"/>
         </w:rPr>
-        <w:t>, y son cuatro cosas.»</w:t>
+        <w:t>.</w:t>
+      </w:r>
+    </w:p>
+    <w:p>
+      <w:r>
+        <w:rPr>
+          <w:b w:val="0"/>
+          <w:i w:val="0"/>
+        </w:rPr>
+        <w:t xml:space="preserve">La luz de ese faro es nuestra plataforma, </w:t>
+      </w:r>
+      <w:r>
+        <w:rPr>
+          <w:b/>
+          <w:i w:val="0"/>
+        </w:rPr>
+        <w:t>PMO360</w:t>
+      </w:r>
+      <w:r>
+        <w:rPr>
+          <w:b w:val="0"/>
+          <w:i w:val="0"/>
+        </w:rPr>
+        <w:t xml:space="preserve">. El 360 es la vuelta completa: una luz que gira para que </w:t>
+      </w:r>
+      <w:r>
+        <w:rPr>
+          <w:b/>
+          <w:i w:val="0"/>
+        </w:rPr>
+        <w:t>ninguna zona quede en la sombra</w:t>
+      </w:r>
+      <w:r>
+        <w:rPr>
+          <w:b w:val="0"/>
+          <w:i w:val="0"/>
+        </w:rPr>
+        <w:t xml:space="preserve">. Y la encendemos en </w:t>
+      </w:r>
+      <w:r>
+        <w:rPr>
+          <w:b/>
+          <w:i w:val="0"/>
+        </w:rPr>
+        <w:t>cuatro pasos, uno por cada cuarto de vuelta</w:t>
+      </w:r>
+      <w:r>
+        <w:rPr>
+          <w:b w:val="0"/>
+          <w:i w:val="0"/>
+        </w:rPr>
+        <w:t>: cuatro por noventa, trescientos sesenta.»</w:t>
       </w:r>
     </w:p>
     <w:tbl>
@@ -1111,7 +1260,35 @@
           <w:b w:val="0"/>
           <w:i w:val="0"/>
         </w:rPr>
-        <w:t xml:space="preserve">, y son cuatro pasos. Al final les pido una sola cosa: </w:t>
+        <w:t xml:space="preserve">, y son cuatro pasos. La plataforma que lo hace posible se llama </w:t>
+      </w:r>
+      <w:r>
+        <w:rPr>
+          <w:b/>
+          <w:i w:val="0"/>
+        </w:rPr>
+        <w:t>PMO360</w:t>
+      </w:r>
+      <w:r>
+        <w:rPr>
+          <w:b w:val="0"/>
+          <w:i w:val="0"/>
+        </w:rPr>
+        <w:t xml:space="preserve">, porque da la vuelta completa al portafolio: cuatro pasos, uno por cada cuarto de vuelta, </w:t>
+      </w:r>
+      <w:r>
+        <w:rPr>
+          <w:b/>
+          <w:i w:val="0"/>
+        </w:rPr>
+        <w:t>360 grados</w:t>
+      </w:r>
+      <w:r>
+        <w:rPr>
+          <w:b w:val="0"/>
+          <w:i w:val="0"/>
+        </w:rPr>
+        <w:t xml:space="preserve">. Al final les pido una sola cosa: </w:t>
       </w:r>
       <w:r>
         <w:rPr>
@@ -1349,7 +1526,7 @@
                 <w:b w:val="0"/>
                 <w:i/>
               </w:rPr>
-              <w:t>[Transición] «Ver bien es el primer paso. Pero ver tarde no sirve de mucho. Por eso viene la A.»</w:t>
+              <w:t>[Transición] «Ese fue el primer cuarto de vuelta: ver. Pero ver tarde no sirve de mucho. Por eso viene la A.»</w:t>
             </w:r>
           </w:p>
         </w:tc>
@@ -1581,7 +1758,7 @@
                 <w:b w:val="0"/>
                 <w:i/>
               </w:rPr>
-              <w:t>[Transición] «Una alerta sirve si se confía en ella. Y para confiar hace falta la R.»</w:t>
+              <w:t>[Transición] «Segundo cuarto de vuelta: avisar. Una alerta sirve si se confía en ella. Y para confiar hace falta la R.»</w:t>
             </w:r>
           </w:p>
         </w:tc>
@@ -1829,7 +2006,7 @@
                 <w:b w:val="0"/>
                 <w:i/>
               </w:rPr>
-              <w:t>[Transición] «Y la última letra es la que decide si todo esto dura: la O.»</w:t>
+              <w:t>[Transición] «Tercer cuarto de vuelta: respaldar. Y falta el que decide si todo esto dura: la O.»</w:t>
             </w:r>
           </w:p>
         </w:tc>
@@ -2046,6 +2223,61 @@
         </w:rPr>
         <w:t xml:space="preserve"> «¿Qué pasa con este control el día que su dueño no está?»</w:t>
       </w:r>
+    </w:p>
+    <w:tbl>
+      <w:tblPr>
+        <w:tblW w:type="auto" w:w="0"/>
+        <w:jc w:val="center"/>
+        <w:tblLook w:firstColumn="1" w:firstRow="1" w:lastColumn="0" w:lastRow="0" w:noHBand="0" w:noVBand="1" w:val="04A0"/>
+      </w:tblPr>
+      <w:tblGrid>
+        <w:gridCol w:w="9638"/>
+      </w:tblGrid>
+      <w:tr>
+        <w:tc>
+          <w:tcPr>
+            <w:tcW w:type="dxa" w:w="9638"/>
+            <w:shd w:val="clear" w:color="auto" w:fill="FFF8E8"/>
+            <w:tcBorders>
+              <w:top w:val="nil"/>
+              <w:left w:val="single" w:sz="24" w:color="7C401D"/>
+              <w:bottom w:val="nil"/>
+              <w:right w:val="nil"/>
+            </w:tcBorders>
+          </w:tcPr>
+          <w:p>
+            <w:pPr>
+              <w:spacing w:after="40"/>
+            </w:pPr>
+            <w:r>
+              <w:rPr>
+                <w:b w:val="0"/>
+                <w:i/>
+              </w:rPr>
+              <w:t xml:space="preserve">[Cierre de la vuelta] «Cuarto cuarto: sostener. Con este se completa la vuelta: </w:t>
+            </w:r>
+            <w:r>
+              <w:rPr>
+                <w:b/>
+                <w:i/>
+              </w:rPr>
+              <w:t>360 grados, ningún punto ciego.</w:t>
+            </w:r>
+            <w:r>
+              <w:rPr>
+                <w:b w:val="0"/>
+                <w:i/>
+              </w:rPr>
+              <w:t xml:space="preserve"> Eso es PMO360.»</w:t>
+            </w:r>
+          </w:p>
+        </w:tc>
+      </w:tr>
+    </w:tbl>
+    <w:p>
+      <w:pPr>
+        <w:spacing w:after="40"/>
+      </w:pPr>
     </w:p>
     <w:p>
       <w:pPr>
@@ -2287,7 +2519,21 @@
           <w:b w:val="0"/>
           <w:i w:val="0"/>
         </w:rPr>
-        <w:t xml:space="preserve">«Un faro no se evalúa por cuánto brilla en un papel. Se evalúa por </w:t>
+        <w:t>«</w:t>
+      </w:r>
+      <w:r>
+        <w:rPr>
+          <w:b/>
+          <w:i w:val="0"/>
+        </w:rPr>
+        <w:t>PMO360 es la luz; FARO es cómo la mantenemos encendida.</w:t>
+      </w:r>
+      <w:r>
+        <w:rPr>
+          <w:b w:val="0"/>
+          <w:i w:val="0"/>
+        </w:rPr>
+        <w:t xml:space="preserve"> Y un faro no se evalúa por cuánto brilla en un papel, sino por </w:t>
       </w:r>
       <w:r>
         <w:rPr>

</xml_diff>